<commit_message>
fix(vault): make résumé chunking robust to real PDF/Word formatting
The profile→vault chunker only understood ASCII '- • *' bullets and ALL-CAPS
headings, so a real uploaded résumé (● glyph bullets, Title-Case sections,
'Category: a, b' skills) seeded the vault poorly — degrading RAG retrieval and
grounded tailoring.

- Recognize the bullet glyphs real docs use (● ▪ ◦ ‣ · – — » …), and skip a
  stray glyph left alone on a line by PDF layout.
- Recognize sections by known name in any case (Work Experience, Technical
  Skills, Professional Summary, Objective…) as well as the ALL-CAPS heuristic,
  normalizing synonyms so SKILLS/SUMMARY handling still fires.
- Skills: drop a leading 'Category:' label and split top-level only, so
  parentheticals like 'AWS (S3, ECS, SageMaker)' stay one skill and 'S3/ECS'
  isn't split.
- Sample résumé regenerated (txt/pdf/docx) with unwrapped skills lines.
- vault.unit: added a real-world-formatting chunking test. All suites green.
</commit_message>
<xml_diff>
--- a/samples/sample-data-scientist-resume.docx
+++ b/samples/sample-data-scientist-resume.docx
@@ -736,73 +736,40 @@
           <w:sz w:val="24"/>
           <w:sz-cs w:val="24"/>
         </w:rPr>
-        <w:t xml:space="preserve">Languages:      Python, SQL, R, a little Go</w:t>
-      </w:r>
-    </w:p>
-    <w:p>
-      <w:pPr/>
-      <w:r>
-        <w:rPr>
-          <w:rFonts w:ascii="Helvetica Light" w:hAnsi="Helvetica Light" w:cs="Helvetica Light"/>
-          <w:sz w:val="24"/>
-          <w:sz-cs w:val="24"/>
-        </w:rPr>
-        <w:t xml:space="preserve">ML / Modeling:  PyTorch, scikit-learn, LightGBM/XGBoost, statsmodels,</w:t>
-      </w:r>
-    </w:p>
-    <w:p>
-      <w:pPr/>
-      <w:r>
-        <w:rPr>
-          <w:rFonts w:ascii="Helvetica Light" w:hAnsi="Helvetica Light" w:cs="Helvetica Light"/>
-          <w:sz w:val="24"/>
-          <w:sz-cs w:val="24"/>
-        </w:rPr>
-        <w:t xml:space="preserve">                Hugging Face Transformers, time-series forecasting, A/B testing</w:t>
-      </w:r>
-    </w:p>
-    <w:p>
-      <w:pPr/>
-      <w:r>
-        <w:rPr>
-          <w:rFonts w:ascii="Helvetica Light" w:hAnsi="Helvetica Light" w:cs="Helvetica Light"/>
-          <w:sz w:val="24"/>
-          <w:sz-cs w:val="24"/>
-        </w:rPr>
-        <w:t xml:space="preserve">Data / Infra:   pandas, Spark, dbt, Airflow, PostgreSQL, Snowflake, feature</w:t>
-      </w:r>
-    </w:p>
-    <w:p>
-      <w:pPr/>
-      <w:r>
-        <w:rPr>
-          <w:rFonts w:ascii="Helvetica Light" w:hAnsi="Helvetica Light" w:cs="Helvetica Light"/>
-          <w:sz w:val="24"/>
-          <w:sz-cs w:val="24"/>
-        </w:rPr>
-        <w:t xml:space="preserve">                stores, Docker, AWS (S3, ECS, SageMaker)</w:t>
-      </w:r>
-    </w:p>
-    <w:p>
-      <w:pPr/>
-      <w:r>
-        <w:rPr>
-          <w:rFonts w:ascii="Helvetica Light" w:hAnsi="Helvetica Light" w:cs="Helvetica Light"/>
-          <w:sz w:val="24"/>
-          <w:sz-cs w:val="24"/>
-        </w:rPr>
-        <w:t xml:space="preserve">Practice:       experimental design, causal inference basics, model monitoring,</w:t>
-      </w:r>
-    </w:p>
-    <w:p>
-      <w:pPr/>
-      <w:r>
-        <w:rPr>
-          <w:rFonts w:ascii="Helvetica Light" w:hAnsi="Helvetica Light" w:cs="Helvetica Light"/>
-          <w:sz w:val="24"/>
-          <w:sz-cs w:val="24"/>
-        </w:rPr>
-        <w:t xml:space="preserve">                data visualization (Plotly, matplotlib), clear technical writing</w:t>
+        <w:t xml:space="preserve">Languages: Python, SQL, R, a little Go</w:t>
+      </w:r>
+    </w:p>
+    <w:p>
+      <w:pPr/>
+      <w:r>
+        <w:rPr>
+          <w:rFonts w:ascii="Helvetica Light" w:hAnsi="Helvetica Light" w:cs="Helvetica Light"/>
+          <w:sz w:val="24"/>
+          <w:sz-cs w:val="24"/>
+        </w:rPr>
+        <w:t xml:space="preserve">ML / Modeling: PyTorch, scikit-learn, LightGBM/XGBoost, statsmodels, Hugging Face Transformers, time-series forecasting, A/B testing</w:t>
+      </w:r>
+    </w:p>
+    <w:p>
+      <w:pPr/>
+      <w:r>
+        <w:rPr>
+          <w:rFonts w:ascii="Helvetica Light" w:hAnsi="Helvetica Light" w:cs="Helvetica Light"/>
+          <w:sz w:val="24"/>
+          <w:sz-cs w:val="24"/>
+        </w:rPr>
+        <w:t xml:space="preserve">Data / Infra: pandas, Spark, dbt, Airflow, PostgreSQL, Snowflake, feature stores, Docker, AWS (S3, ECS, SageMaker)</w:t>
+      </w:r>
+    </w:p>
+    <w:p>
+      <w:pPr/>
+      <w:r>
+        <w:rPr>
+          <w:rFonts w:ascii="Helvetica Light" w:hAnsi="Helvetica Light" w:cs="Helvetica Light"/>
+          <w:sz w:val="24"/>
+          <w:sz-cs w:val="24"/>
+        </w:rPr>
+        <w:t xml:space="preserve">Practice: experimental design, causal inference basics, model monitoring, data visualization (Plotly, matplotlib), clear technical writing</w:t>
       </w:r>
     </w:p>
     <w:sectPr/>

</xml_diff>